<commit_message>
docs: agregar evidencias remotas de despliegue
</commit_message>
<xml_diff>
--- a/docs/informe_frost_puno_completo.docx
+++ b/docs/informe_frost_puno_completo.docx
@@ -3471,7 +3471,7 @@
         <w:pStyle w:val="ListBullet"/>
       </w:pPr>
       <w:r>
-        <w:t>Flutter Web en Vercel, configurando API_BASE_URL=https://frost-puno.onrender.com;</w:t>
+        <w:t>Flutter Web en Vercel, disponible en https://frost-puno.vercel.app y configurado con API_BASE_URL=https://frost-puno.onrender.com;</w:t>
       </w:r>
     </w:p>
     <w:p>
@@ -3496,6 +3496,468 @@
       </w:pPr>
       <w:r>
         <w:t>Android APK para demo móvil con GPS y consumo del backend remoto.</w:t>
+      </w:r>
+    </w:p>
+    <w:p/>
+    <w:p>
+      <w:pPr>
+        <w:pStyle w:val="Heading2"/>
+      </w:pPr>
+      <w:r>
+        <w:t>18.0 Trazabilidad de ramas y versiones</w:t>
+      </w:r>
+    </w:p>
+    <w:p/>
+    <w:p>
+      <w:r>
+        <w:t>El despliegue se organiza para no romper producción:</w:t>
+      </w:r>
+    </w:p>
+    <w:p/>
+    <w:tbl>
+      <w:tblPr>
+        <w:tblW w:type="auto" w:w="0"/>
+        <w:jc w:val="center"/>
+        <w:tblLayout w:type="fixed"/>
+        <w:tblLook w:firstColumn="1" w:firstRow="1" w:lastColumn="0" w:lastRow="0" w:noHBand="0" w:noVBand="1" w:val="04A0"/>
+        <w:tblBorders>
+          <w:top w:val="single" w:sz="4" w:space="0" w:color="D9E2EC"/>
+          <w:left w:val="single" w:sz="4" w:space="0" w:color="D9E2EC"/>
+          <w:bottom w:val="single" w:sz="4" w:space="0" w:color="D9E2EC"/>
+          <w:right w:val="single" w:sz="4" w:space="0" w:color="D9E2EC"/>
+          <w:insideH w:val="single" w:sz="4" w:space="0" w:color="D9E2EC"/>
+          <w:insideV w:val="single" w:sz="4" w:space="0" w:color="D9E2EC"/>
+        </w:tblBorders>
+      </w:tblPr>
+      <w:tblGrid>
+        <w:gridCol w:w="2340"/>
+        <w:gridCol w:w="2340"/>
+        <w:gridCol w:w="2340"/>
+        <w:gridCol w:w="2340"/>
+      </w:tblGrid>
+      <w:tr>
+        <w:tc>
+          <w:tcPr>
+            <w:tcW w:type="dxa" w:w="2340"/>
+            <w:vAlign w:val="center"/>
+            <w:shd w:fill="E8EEF5"/>
+          </w:tcPr>
+          <w:p>
+            <w:pPr>
+              <w:spacing w:after="0"/>
+            </w:pPr>
+            <w:r>
+              <w:rPr>
+                <w:rFonts w:ascii="Arial" w:hAnsi="Arial"/>
+                <w:b/>
+                <w:color w:val="0B2545"/>
+                <w:sz w:val="18"/>
+              </w:rPr>
+              <w:t>Componente</w:t>
+            </w:r>
+          </w:p>
+        </w:tc>
+        <w:tc>
+          <w:tcPr>
+            <w:tcW w:type="dxa" w:w="2340"/>
+            <w:vAlign w:val="center"/>
+            <w:shd w:fill="E8EEF5"/>
+          </w:tcPr>
+          <w:p>
+            <w:pPr>
+              <w:spacing w:after="0"/>
+            </w:pPr>
+            <w:r>
+              <w:rPr>
+                <w:rFonts w:ascii="Arial" w:hAnsi="Arial"/>
+                <w:b/>
+                <w:color w:val="0B2545"/>
+                <w:sz w:val="18"/>
+              </w:rPr>
+              <w:t>Rama / archivo</w:t>
+            </w:r>
+          </w:p>
+        </w:tc>
+        <w:tc>
+          <w:tcPr>
+            <w:tcW w:type="dxa" w:w="2340"/>
+            <w:vAlign w:val="center"/>
+            <w:shd w:fill="E8EEF5"/>
+          </w:tcPr>
+          <w:p>
+            <w:pPr>
+              <w:spacing w:after="0"/>
+            </w:pPr>
+            <w:r>
+              <w:rPr>
+                <w:rFonts w:ascii="Arial" w:hAnsi="Arial"/>
+                <w:b/>
+                <w:color w:val="0B2545"/>
+                <w:sz w:val="18"/>
+              </w:rPr>
+              <w:t>Estado</w:t>
+            </w:r>
+          </w:p>
+        </w:tc>
+        <w:tc>
+          <w:tcPr>
+            <w:tcW w:type="dxa" w:w="2340"/>
+            <w:vAlign w:val="center"/>
+            <w:shd w:fill="E8EEF5"/>
+          </w:tcPr>
+          <w:p>
+            <w:pPr>
+              <w:spacing w:after="0"/>
+            </w:pPr>
+            <w:r>
+              <w:rPr>
+                <w:rFonts w:ascii="Arial" w:hAnsi="Arial"/>
+                <w:b/>
+                <w:color w:val="0B2545"/>
+                <w:sz w:val="18"/>
+              </w:rPr>
+              <w:t>Modelo</w:t>
+            </w:r>
+          </w:p>
+        </w:tc>
+      </w:tr>
+    </w:tbl>
+    <w:p/>
+    <w:tbl>
+      <w:tblPr>
+        <w:tblW w:type="auto" w:w="0"/>
+        <w:jc w:val="center"/>
+        <w:tblLayout w:type="fixed"/>
+        <w:tblLook w:firstColumn="1" w:firstRow="1" w:lastColumn="0" w:lastRow="0" w:noHBand="0" w:noVBand="1" w:val="04A0"/>
+        <w:tblBorders>
+          <w:top w:val="single" w:sz="4" w:space="0" w:color="D9E2EC"/>
+          <w:left w:val="single" w:sz="4" w:space="0" w:color="D9E2EC"/>
+          <w:bottom w:val="single" w:sz="4" w:space="0" w:color="D9E2EC"/>
+          <w:right w:val="single" w:sz="4" w:space="0" w:color="D9E2EC"/>
+          <w:insideH w:val="single" w:sz="4" w:space="0" w:color="D9E2EC"/>
+          <w:insideV w:val="single" w:sz="4" w:space="0" w:color="D9E2EC"/>
+        </w:tblBorders>
+      </w:tblPr>
+      <w:tblGrid>
+        <w:gridCol w:w="2340"/>
+        <w:gridCol w:w="2340"/>
+        <w:gridCol w:w="2340"/>
+        <w:gridCol w:w="2340"/>
+      </w:tblGrid>
+      <w:tr>
+        <w:tc>
+          <w:tcPr>
+            <w:tcW w:type="dxa" w:w="2340"/>
+            <w:vAlign w:val="center"/>
+            <w:shd w:fill="E8EEF5"/>
+          </w:tcPr>
+          <w:p>
+            <w:pPr>
+              <w:spacing w:after="0"/>
+            </w:pPr>
+            <w:r>
+              <w:rPr>
+                <w:rFonts w:ascii="Arial" w:hAnsi="Arial"/>
+                <w:b/>
+                <w:color w:val="0B2545"/>
+                <w:sz w:val="18"/>
+              </w:rPr>
+              <w:t>Backend Render productivo</w:t>
+            </w:r>
+          </w:p>
+        </w:tc>
+        <w:tc>
+          <w:tcPr>
+            <w:tcW w:type="dxa" w:w="2340"/>
+            <w:vAlign w:val="center"/>
+            <w:shd w:fill="E8EEF5"/>
+          </w:tcPr>
+          <w:p>
+            <w:pPr>
+              <w:spacing w:after="0"/>
+            </w:pPr>
+            <w:r>
+              <w:rPr>
+                <w:rFonts w:ascii="Arial" w:hAnsi="Arial"/>
+                <w:b/>
+                <w:color w:val="0B2545"/>
+                <w:sz w:val="18"/>
+              </w:rPr>
+              <w:t>main + render.yaml</w:t>
+            </w:r>
+          </w:p>
+        </w:tc>
+        <w:tc>
+          <w:tcPr>
+            <w:tcW w:type="dxa" w:w="2340"/>
+            <w:vAlign w:val="center"/>
+            <w:shd w:fill="E8EEF5"/>
+          </w:tcPr>
+          <w:p>
+            <w:pPr>
+              <w:spacing w:after="0"/>
+            </w:pPr>
+            <w:r>
+              <w:rPr>
+                <w:rFonts w:ascii="Arial" w:hAnsi="Arial"/>
+                <w:b/>
+                <w:color w:val="0B2545"/>
+                <w:sz w:val="18"/>
+              </w:rPr>
+              <w:t>Desplegado en https://frost-puno.onrender.com</w:t>
+            </w:r>
+          </w:p>
+        </w:tc>
+        <w:tc>
+          <w:tcPr>
+            <w:tcW w:type="dxa" w:w="2340"/>
+            <w:vAlign w:val="center"/>
+            <w:shd w:fill="E8EEF5"/>
+          </w:tcPr>
+          <w:p>
+            <w:pPr>
+              <w:spacing w:after="0"/>
+            </w:pPr>
+            <w:r>
+              <w:rPr>
+                <w:rFonts w:ascii="Arial" w:hAnsi="Arial"/>
+                <w:b/>
+                <w:color w:val="0B2545"/>
+                <w:sz w:val="18"/>
+              </w:rPr>
+              <w:t>v0.1.0</w:t>
+            </w:r>
+          </w:p>
+        </w:tc>
+      </w:tr>
+      <w:tr>
+        <w:tc>
+          <w:tcPr>
+            <w:tcW w:type="dxa" w:w="2340"/>
+            <w:vAlign w:val="center"/>
+          </w:tcPr>
+          <w:p>
+            <w:pPr>
+              <w:spacing w:after="0"/>
+            </w:pPr>
+            <w:r>
+              <w:rPr>
+                <w:rFonts w:ascii="Arial" w:hAnsi="Arial"/>
+                <w:sz w:val="18"/>
+              </w:rPr>
+              <w:t>Frontend Vercel</w:t>
+            </w:r>
+          </w:p>
+        </w:tc>
+        <w:tc>
+          <w:tcPr>
+            <w:tcW w:type="dxa" w:w="2340"/>
+            <w:vAlign w:val="center"/>
+          </w:tcPr>
+          <w:p>
+            <w:pPr>
+              <w:spacing w:after="0"/>
+            </w:pPr>
+            <w:r>
+              <w:rPr>
+                <w:rFonts w:ascii="Arial" w:hAnsi="Arial"/>
+                <w:sz w:val="18"/>
+              </w:rPr>
+              <w:t>app_flutter/vercel.json</w:t>
+            </w:r>
+          </w:p>
+        </w:tc>
+        <w:tc>
+          <w:tcPr>
+            <w:tcW w:type="dxa" w:w="2340"/>
+            <w:vAlign w:val="center"/>
+          </w:tcPr>
+          <w:p>
+            <w:pPr>
+              <w:spacing w:after="0"/>
+            </w:pPr>
+            <w:r>
+              <w:rPr>
+                <w:rFonts w:ascii="Arial" w:hAnsi="Arial"/>
+                <w:sz w:val="18"/>
+              </w:rPr>
+              <w:t>Desplegado en https://frost-puno.vercel.app</w:t>
+            </w:r>
+          </w:p>
+        </w:tc>
+        <w:tc>
+          <w:tcPr>
+            <w:tcW w:type="dxa" w:w="2340"/>
+            <w:vAlign w:val="center"/>
+          </w:tcPr>
+          <w:p>
+            <w:pPr>
+              <w:spacing w:after="0"/>
+            </w:pPr>
+            <w:r>
+              <w:rPr>
+                <w:rFonts w:ascii="Arial" w:hAnsi="Arial"/>
+                <w:sz w:val="18"/>
+              </w:rPr>
+              <w:t>consume API productiva</w:t>
+            </w:r>
+          </w:p>
+        </w:tc>
+      </w:tr>
+      <w:tr>
+        <w:tc>
+          <w:tcPr>
+            <w:tcW w:type="dxa" w:w="2340"/>
+            <w:vAlign w:val="center"/>
+          </w:tcPr>
+          <w:p>
+            <w:pPr>
+              <w:spacing w:after="0"/>
+            </w:pPr>
+            <w:r>
+              <w:rPr>
+                <w:rFonts w:ascii="Arial" w:hAnsi="Arial"/>
+                <w:sz w:val="18"/>
+              </w:rPr>
+              <w:t>ML experimental</w:t>
+            </w:r>
+          </w:p>
+        </w:tc>
+        <w:tc>
+          <w:tcPr>
+            <w:tcW w:type="dxa" w:w="2340"/>
+            <w:vAlign w:val="center"/>
+          </w:tcPr>
+          <w:p>
+            <w:pPr>
+              <w:spacing w:after="0"/>
+            </w:pPr>
+            <w:r>
+              <w:rPr>
+                <w:rFonts w:ascii="Arial" w:hAnsi="Arial"/>
+                <w:sz w:val="18"/>
+              </w:rPr>
+              <w:t>codex/model-v0-2-0</w:t>
+            </w:r>
+          </w:p>
+        </w:tc>
+        <w:tc>
+          <w:tcPr>
+            <w:tcW w:type="dxa" w:w="2340"/>
+            <w:vAlign w:val="center"/>
+          </w:tcPr>
+          <w:p>
+            <w:pPr>
+              <w:spacing w:after="0"/>
+            </w:pPr>
+            <w:r>
+              <w:rPr>
+                <w:rFonts w:ascii="Arial" w:hAnsi="Arial"/>
+                <w:sz w:val="18"/>
+              </w:rPr>
+              <w:t>Rama subida a GitHub</w:t>
+            </w:r>
+          </w:p>
+        </w:tc>
+        <w:tc>
+          <w:tcPr>
+            <w:tcW w:type="dxa" w:w="2340"/>
+            <w:vAlign w:val="center"/>
+          </w:tcPr>
+          <w:p>
+            <w:pPr>
+              <w:spacing w:after="0"/>
+            </w:pPr>
+            <w:r>
+              <w:rPr>
+                <w:rFonts w:ascii="Arial" w:hAnsi="Arial"/>
+                <w:sz w:val="18"/>
+              </w:rPr>
+              <w:t>v0.2.0</w:t>
+            </w:r>
+          </w:p>
+        </w:tc>
+      </w:tr>
+      <w:tr>
+        <w:tc>
+          <w:tcPr>
+            <w:tcW w:type="dxa" w:w="2340"/>
+            <w:vAlign w:val="center"/>
+          </w:tcPr>
+          <w:p>
+            <w:pPr>
+              <w:spacing w:after="0"/>
+            </w:pPr>
+            <w:r>
+              <w:rPr>
+                <w:rFonts w:ascii="Arial" w:hAnsi="Arial"/>
+                <w:sz w:val="18"/>
+              </w:rPr>
+              <w:t>Backend Render experimental</w:t>
+            </w:r>
+          </w:p>
+        </w:tc>
+        <w:tc>
+          <w:tcPr>
+            <w:tcW w:type="dxa" w:w="2340"/>
+            <w:vAlign w:val="center"/>
+          </w:tcPr>
+          <w:p>
+            <w:pPr>
+              <w:spacing w:after="0"/>
+            </w:pPr>
+            <w:r>
+              <w:rPr>
+                <w:rFonts w:ascii="Arial" w:hAnsi="Arial"/>
+                <w:sz w:val="18"/>
+              </w:rPr>
+              <w:t>render.v2.yaml</w:t>
+            </w:r>
+          </w:p>
+        </w:tc>
+        <w:tc>
+          <w:tcPr>
+            <w:tcW w:type="dxa" w:w="2340"/>
+            <w:vAlign w:val="center"/>
+          </w:tcPr>
+          <w:p>
+            <w:pPr>
+              <w:spacing w:after="0"/>
+            </w:pPr>
+            <w:r>
+              <w:rPr>
+                <w:rFonts w:ascii="Arial" w:hAnsi="Arial"/>
+                <w:sz w:val="18"/>
+              </w:rPr>
+              <w:t>Configurado, pendiente de crear servicio</w:t>
+            </w:r>
+          </w:p>
+        </w:tc>
+        <w:tc>
+          <w:tcPr>
+            <w:tcW w:type="dxa" w:w="2340"/>
+            <w:vAlign w:val="center"/>
+          </w:tcPr>
+          <w:p>
+            <w:pPr>
+              <w:spacing w:after="0"/>
+            </w:pPr>
+            <w:r>
+              <w:rPr>
+                <w:rFonts w:ascii="Arial" w:hAnsi="Arial"/>
+                <w:sz w:val="18"/>
+              </w:rPr>
+              <w:t>v0.2.0</w:t>
+            </w:r>
+          </w:p>
+        </w:tc>
+      </w:tr>
+    </w:tbl>
+    <w:p/>
+    <w:p/>
+    <w:p>
+      <w:r>
+        <w:t>La versión v0.2.0 no reemplaza producción. Se despliega como servicio separado recomendado (frost-puno-api-v2) para evaluación académica de Aprendizaje de Máquina.</w:t>
       </w:r>
     </w:p>
     <w:p/>
@@ -3564,6 +4026,47 @@
     </w:p>
     <w:p/>
     <w:p>
+      <w:r>
+        <w:t>Para desplegar la versión experimental v0.2.0 sin tocar producción se agregó render.v2.yaml. Ese archivo configura:</w:t>
+      </w:r>
+    </w:p>
+    <w:p/>
+    <w:p>
+      <w:pPr>
+        <w:spacing w:after="20"/>
+        <w:ind w:left="259"/>
+      </w:pPr>
+      <w:r>
+        <w:rPr>
+          <w:rFonts w:ascii="Consolas" w:hAnsi="Consolas"/>
+          <w:color w:val="0B2545"/>
+          <w:sz w:val="17"/>
+        </w:rPr>
+        <w:t>MODEL_PATH=ml_pipeline/registry/frost_risk_model_v0_2_0.joblib</w:t>
+      </w:r>
+    </w:p>
+    <w:p>
+      <w:pPr>
+        <w:spacing w:after="20"/>
+        <w:ind w:left="259"/>
+      </w:pPr>
+      <w:r>
+        <w:rPr>
+          <w:rFonts w:ascii="Consolas" w:hAnsi="Consolas"/>
+          <w:color w:val="0B2545"/>
+          <w:sz w:val="17"/>
+        </w:rPr>
+        <w:t>MODEL_METADATA_PATH=ml_pipeline/registry/model_metadata_v0_2_0.json</w:t>
+      </w:r>
+    </w:p>
+    <w:p/>
+    <w:p>
+      <w:r>
+        <w:t>La sugerencia operativa es crear en Render un segundo servicio desde la rama codex/model-v0-2-0, con nombre frost-puno-api-v2, y desactivar autoDeploy hasta validar métricas, endpoints y recomendaciones.</w:t>
+      </w:r>
+    </w:p>
+    <w:p/>
+    <w:p>
       <w:pPr>
         <w:pStyle w:val="Heading2"/>
       </w:pPr>
@@ -3590,6 +4093,12 @@
     <w:p>
       <w:r>
         <w:t>Supabase queda preparado mediante migraciones, seed y políticas RLS. Flutter no accede directamente a Supabase; todas las escrituras pasan por FastAPI. La clave service_role debe residir solo en Render o en secretos seguros de infraestructura.</w:t>
+      </w:r>
+    </w:p>
+    <w:p/>
+    <w:p>
+      <w:r>
+        <w:t>Durante la generación automática de evidencias, los conectores privados de GitHub, Vercel y Supabase devolvieron token_expired. Por ello, las capturas de dashboard privado deben repetirse tras reautenticar los conectores o desde la sesión web del navegador. Las evidencias incluidas muestran el estado público del despliegue y la configuración versionada.</w:t>
       </w:r>
     </w:p>
     <w:p/>
@@ -3719,7 +4228,7 @@
       <w:r>
         <w:drawing>
           <wp:inline xmlns:a="http://schemas.openxmlformats.org/drawingml/2006/main" xmlns:pic="http://schemas.openxmlformats.org/drawingml/2006/picture">
-            <wp:extent cx="5669280" cy="18701153"/>
+            <wp:extent cx="5669280" cy="25814730"/>
             <wp:docPr id="1" name="Picture 1"/>
             <wp:cNvGraphicFramePr>
               <a:graphicFrameLocks noChangeAspect="1"/>
@@ -3740,7 +4249,7 @@
                   <pic:spPr>
                     <a:xfrm>
                       <a:off x="0" y="0"/>
-                      <a:ext cx="5669280" cy="18701153"/>
+                      <a:ext cx="5669280" cy="25814730"/>
                     </a:xfrm>
                     <a:prstGeom prst="rect"/>
                   </pic:spPr>
@@ -5193,7 +5702,7 @@
       <w:r>
         <w:drawing>
           <wp:inline xmlns:a="http://schemas.openxmlformats.org/drawingml/2006/main" xmlns:pic="http://schemas.openxmlformats.org/drawingml/2006/picture">
-            <wp:extent cx="5669280" cy="14945152"/>
+            <wp:extent cx="5669280" cy="19639116"/>
             <wp:docPr id="23" name="Picture 23"/>
             <wp:cNvGraphicFramePr>
               <a:graphicFrameLocks noChangeAspect="1"/>
@@ -5214,7 +5723,7 @@
                   <pic:spPr>
                     <a:xfrm>
                       <a:off x="0" y="0"/>
-                      <a:ext cx="5669280" cy="14945152"/>
+                      <a:ext cx="5669280" cy="19639116"/>
                     </a:xfrm>
                     <a:prstGeom prst="rect"/>
                   </pic:spPr>
@@ -5311,6 +5820,877 @@
       </w:r>
     </w:p>
     <w:p/>
+    <w:p>
+      <w:pPr>
+        <w:pStyle w:val="Heading2"/>
+      </w:pPr>
+      <w:r>
+        <w:t>Captura 25: GitHub repositorio</w:t>
+      </w:r>
+    </w:p>
+    <w:p/>
+    <w:p>
+      <w:pPr>
+        <w:jc w:val="center"/>
+      </w:pPr>
+      <w:r>
+        <w:drawing>
+          <wp:inline xmlns:a="http://schemas.openxmlformats.org/drawingml/2006/main" xmlns:pic="http://schemas.openxmlformats.org/drawingml/2006/picture">
+            <wp:extent cx="5669280" cy="21378083"/>
+            <wp:docPr id="25" name="Picture 25"/>
+            <wp:cNvGraphicFramePr>
+              <a:graphicFrameLocks noChangeAspect="1"/>
+            </wp:cNvGraphicFramePr>
+            <a:graphic>
+              <a:graphicData uri="http://schemas.openxmlformats.org/drawingml/2006/picture">
+                <pic:pic>
+                  <pic:nvPicPr>
+                    <pic:cNvPr id="0" name="25_github_repo.png"/>
+                    <pic:cNvPicPr/>
+                  </pic:nvPicPr>
+                  <pic:blipFill>
+                    <a:blip r:embed="rId33"/>
+                    <a:stretch>
+                      <a:fillRect/>
+                    </a:stretch>
+                  </pic:blipFill>
+                  <pic:spPr>
+                    <a:xfrm>
+                      <a:off x="0" y="0"/>
+                      <a:ext cx="5669280" cy="21378083"/>
+                    </a:xfrm>
+                    <a:prstGeom prst="rect"/>
+                  </pic:spPr>
+                </pic:pic>
+              </a:graphicData>
+            </a:graphic>
+          </wp:inline>
+        </w:drawing>
+      </w:r>
+    </w:p>
+    <w:p>
+      <w:pPr>
+        <w:jc w:val="center"/>
+      </w:pPr>
+      <w:r>
+        <w:rPr>
+          <w:i/>
+          <w:sz w:val="18"/>
+        </w:rPr>
+        <w:t>Captura 25. GitHub repositorio</w:t>
+      </w:r>
+    </w:p>
+    <w:p/>
+    <w:p>
+      <w:r>
+        <w:t>La captura muestra el repositorio público JosephElvisMaman1/frost-puno, base de trazabilidad para ramas, commits, CI/CD y despliegues.</w:t>
+      </w:r>
+    </w:p>
+    <w:p/>
+    <w:p>
+      <w:pPr>
+        <w:pStyle w:val="Heading2"/>
+      </w:pPr>
+      <w:r>
+        <w:t>Captura 26: GitHub rama v0.2.0</w:t>
+      </w:r>
+    </w:p>
+    <w:p/>
+    <w:p>
+      <w:pPr>
+        <w:jc w:val="center"/>
+      </w:pPr>
+      <w:r>
+        <w:drawing>
+          <wp:inline xmlns:a="http://schemas.openxmlformats.org/drawingml/2006/main" xmlns:pic="http://schemas.openxmlformats.org/drawingml/2006/picture">
+            <wp:extent cx="5669280" cy="22739374"/>
+            <wp:docPr id="26" name="Picture 26"/>
+            <wp:cNvGraphicFramePr>
+              <a:graphicFrameLocks noChangeAspect="1"/>
+            </wp:cNvGraphicFramePr>
+            <a:graphic>
+              <a:graphicData uri="http://schemas.openxmlformats.org/drawingml/2006/picture">
+                <pic:pic>
+                  <pic:nvPicPr>
+                    <pic:cNvPr id="0" name="26_github_branch_v0_2_0.png"/>
+                    <pic:cNvPicPr/>
+                  </pic:nvPicPr>
+                  <pic:blipFill>
+                    <a:blip r:embed="rId34"/>
+                    <a:stretch>
+                      <a:fillRect/>
+                    </a:stretch>
+                  </pic:blipFill>
+                  <pic:spPr>
+                    <a:xfrm>
+                      <a:off x="0" y="0"/>
+                      <a:ext cx="5669280" cy="22739374"/>
+                    </a:xfrm>
+                    <a:prstGeom prst="rect"/>
+                  </pic:spPr>
+                </pic:pic>
+              </a:graphicData>
+            </a:graphic>
+          </wp:inline>
+        </w:drawing>
+      </w:r>
+    </w:p>
+    <w:p>
+      <w:pPr>
+        <w:jc w:val="center"/>
+      </w:pPr>
+      <w:r>
+        <w:rPr>
+          <w:i/>
+          <w:sz w:val="18"/>
+        </w:rPr>
+        <w:t>Captura 26. Rama v0.2.0</w:t>
+      </w:r>
+    </w:p>
+    <w:p/>
+    <w:p>
+      <w:r>
+        <w:t>La evidencia muestra la rama codex/model-v0-2-0, donde se versionó el dataset sin leakage, el modelo experimental y el informe completo.</w:t>
+      </w:r>
+    </w:p>
+    <w:p/>
+    <w:p>
+      <w:pPr>
+        <w:pStyle w:val="Heading2"/>
+      </w:pPr>
+      <w:r>
+        <w:t>Captura 27: GitHub commits v0.2.0</w:t>
+      </w:r>
+    </w:p>
+    <w:p/>
+    <w:p>
+      <w:pPr>
+        <w:jc w:val="center"/>
+      </w:pPr>
+      <w:r>
+        <w:drawing>
+          <wp:inline xmlns:a="http://schemas.openxmlformats.org/drawingml/2006/main" xmlns:pic="http://schemas.openxmlformats.org/drawingml/2006/picture">
+            <wp:extent cx="5669280" cy="4693965"/>
+            <wp:docPr id="27" name="Picture 27"/>
+            <wp:cNvGraphicFramePr>
+              <a:graphicFrameLocks noChangeAspect="1"/>
+            </wp:cNvGraphicFramePr>
+            <a:graphic>
+              <a:graphicData uri="http://schemas.openxmlformats.org/drawingml/2006/picture">
+                <pic:pic>
+                  <pic:nvPicPr>
+                    <pic:cNvPr id="0" name="27_github_commits_v0_2_0.png"/>
+                    <pic:cNvPicPr/>
+                  </pic:nvPicPr>
+                  <pic:blipFill>
+                    <a:blip r:embed="rId35"/>
+                    <a:stretch>
+                      <a:fillRect/>
+                    </a:stretch>
+                  </pic:blipFill>
+                  <pic:spPr>
+                    <a:xfrm>
+                      <a:off x="0" y="0"/>
+                      <a:ext cx="5669280" cy="4693965"/>
+                    </a:xfrm>
+                    <a:prstGeom prst="rect"/>
+                  </pic:spPr>
+                </pic:pic>
+              </a:graphicData>
+            </a:graphic>
+          </wp:inline>
+        </w:drawing>
+      </w:r>
+    </w:p>
+    <w:p>
+      <w:pPr>
+        <w:jc w:val="center"/>
+      </w:pPr>
+      <w:r>
+        <w:rPr>
+          <w:i/>
+          <w:sz w:val="18"/>
+        </w:rPr>
+        <w:t>Captura 27. Commits v0.2.0</w:t>
+      </w:r>
+    </w:p>
+    <w:p/>
+    <w:p>
+      <w:r>
+        <w:t>La captura documenta los commits principales de la rama: configuración Android, modelo experimental v0.2.0 e informe/evidencias de despliegue.</w:t>
+      </w:r>
+    </w:p>
+    <w:p/>
+    <w:p>
+      <w:pPr>
+        <w:pStyle w:val="Heading2"/>
+      </w:pPr>
+      <w:r>
+        <w:t>Captura 28: GitHub Actions</w:t>
+      </w:r>
+    </w:p>
+    <w:p/>
+    <w:p>
+      <w:pPr>
+        <w:jc w:val="center"/>
+      </w:pPr>
+      <w:r>
+        <w:drawing>
+          <wp:inline xmlns:a="http://schemas.openxmlformats.org/drawingml/2006/main" xmlns:pic="http://schemas.openxmlformats.org/drawingml/2006/picture">
+            <wp:extent cx="5669280" cy="8180198"/>
+            <wp:docPr id="28" name="Picture 28"/>
+            <wp:cNvGraphicFramePr>
+              <a:graphicFrameLocks noChangeAspect="1"/>
+            </wp:cNvGraphicFramePr>
+            <a:graphic>
+              <a:graphicData uri="http://schemas.openxmlformats.org/drawingml/2006/picture">
+                <pic:pic>
+                  <pic:nvPicPr>
+                    <pic:cNvPr id="0" name="28_github_actions.png"/>
+                    <pic:cNvPicPr/>
+                  </pic:nvPicPr>
+                  <pic:blipFill>
+                    <a:blip r:embed="rId36"/>
+                    <a:stretch>
+                      <a:fillRect/>
+                    </a:stretch>
+                  </pic:blipFill>
+                  <pic:spPr>
+                    <a:xfrm>
+                      <a:off x="0" y="0"/>
+                      <a:ext cx="5669280" cy="8180198"/>
+                    </a:xfrm>
+                    <a:prstGeom prst="rect"/>
+                  </pic:spPr>
+                </pic:pic>
+              </a:graphicData>
+            </a:graphic>
+          </wp:inline>
+        </w:drawing>
+      </w:r>
+    </w:p>
+    <w:p>
+      <w:pPr>
+        <w:jc w:val="center"/>
+      </w:pPr>
+      <w:r>
+        <w:rPr>
+          <w:i/>
+          <w:sz w:val="18"/>
+        </w:rPr>
+        <w:t>Captura 28. GitHub Actions</w:t>
+      </w:r>
+    </w:p>
+    <w:p/>
+    <w:p>
+      <w:r>
+        <w:t>La evidencia muestra la sección Actions del repositorio, donde se ubican los workflows de backend, datos, ML, quality gate y Flutter Web.</w:t>
+      </w:r>
+    </w:p>
+    <w:p/>
+    <w:p>
+      <w:pPr>
+        <w:pStyle w:val="Heading2"/>
+      </w:pPr>
+      <w:r>
+        <w:t>Captura 29: Render health remoto</w:t>
+      </w:r>
+    </w:p>
+    <w:p/>
+    <w:p>
+      <w:pPr>
+        <w:jc w:val="center"/>
+      </w:pPr>
+      <w:r>
+        <w:drawing>
+          <wp:inline xmlns:a="http://schemas.openxmlformats.org/drawingml/2006/main" xmlns:pic="http://schemas.openxmlformats.org/drawingml/2006/picture">
+            <wp:extent cx="5669280" cy="3735250"/>
+            <wp:docPr id="29" name="Picture 29"/>
+            <wp:cNvGraphicFramePr>
+              <a:graphicFrameLocks noChangeAspect="1"/>
+            </wp:cNvGraphicFramePr>
+            <a:graphic>
+              <a:graphicData uri="http://schemas.openxmlformats.org/drawingml/2006/picture">
+                <pic:pic>
+                  <pic:nvPicPr>
+                    <pic:cNvPr id="0" name="29_render_health.png"/>
+                    <pic:cNvPicPr/>
+                  </pic:nvPicPr>
+                  <pic:blipFill>
+                    <a:blip r:embed="rId37"/>
+                    <a:stretch>
+                      <a:fillRect/>
+                    </a:stretch>
+                  </pic:blipFill>
+                  <pic:spPr>
+                    <a:xfrm>
+                      <a:off x="0" y="0"/>
+                      <a:ext cx="5669280" cy="3735250"/>
+                    </a:xfrm>
+                    <a:prstGeom prst="rect"/>
+                  </pic:spPr>
+                </pic:pic>
+              </a:graphicData>
+            </a:graphic>
+          </wp:inline>
+        </w:drawing>
+      </w:r>
+    </w:p>
+    <w:p>
+      <w:pPr>
+        <w:jc w:val="center"/>
+      </w:pPr>
+      <w:r>
+        <w:rPr>
+          <w:i/>
+          <w:sz w:val="18"/>
+        </w:rPr>
+        <w:t>Captura 29. Render health</w:t>
+      </w:r>
+    </w:p>
+    <w:p/>
+    <w:p>
+      <w:r>
+        <w:t>La captura muestra GET /health del backend desplegado en Render, confirmando que FastAPI responde y que el modelo productivo está disponible.</w:t>
+      </w:r>
+    </w:p>
+    <w:p/>
+    <w:p>
+      <w:pPr>
+        <w:pStyle w:val="Heading2"/>
+      </w:pPr>
+      <w:r>
+        <w:t>Captura 30: Render model-info remoto</w:t>
+      </w:r>
+    </w:p>
+    <w:p/>
+    <w:p>
+      <w:pPr>
+        <w:jc w:val="center"/>
+      </w:pPr>
+      <w:r>
+        <w:drawing>
+          <wp:inline xmlns:a="http://schemas.openxmlformats.org/drawingml/2006/main" xmlns:pic="http://schemas.openxmlformats.org/drawingml/2006/picture">
+            <wp:extent cx="5669280" cy="3735250"/>
+            <wp:docPr id="30" name="Picture 30"/>
+            <wp:cNvGraphicFramePr>
+              <a:graphicFrameLocks noChangeAspect="1"/>
+            </wp:cNvGraphicFramePr>
+            <a:graphic>
+              <a:graphicData uri="http://schemas.openxmlformats.org/drawingml/2006/picture">
+                <pic:pic>
+                  <pic:nvPicPr>
+                    <pic:cNvPr id="0" name="30_render_model_info.png"/>
+                    <pic:cNvPicPr/>
+                  </pic:nvPicPr>
+                  <pic:blipFill>
+                    <a:blip r:embed="rId38"/>
+                    <a:stretch>
+                      <a:fillRect/>
+                    </a:stretch>
+                  </pic:blipFill>
+                  <pic:spPr>
+                    <a:xfrm>
+                      <a:off x="0" y="0"/>
+                      <a:ext cx="5669280" cy="3735250"/>
+                    </a:xfrm>
+                    <a:prstGeom prst="rect"/>
+                  </pic:spPr>
+                </pic:pic>
+              </a:graphicData>
+            </a:graphic>
+          </wp:inline>
+        </w:drawing>
+      </w:r>
+    </w:p>
+    <w:p>
+      <w:pPr>
+        <w:jc w:val="center"/>
+      </w:pPr>
+      <w:r>
+        <w:rPr>
+          <w:i/>
+          <w:sz w:val="18"/>
+        </w:rPr>
+        <w:t>Captura 30. Render model-info</w:t>
+      </w:r>
+    </w:p>
+    <w:p/>
+    <w:p>
+      <w:r>
+        <w:t>La evidencia muestra GET /ml/model-info desde Render. Permite verificar qué versión de modelo está activa en producción.</w:t>
+      </w:r>
+    </w:p>
+    <w:p/>
+    <w:p>
+      <w:pPr>
+        <w:pStyle w:val="Heading2"/>
+      </w:pPr>
+      <w:r>
+        <w:t>Captura 31: Render Swagger remoto</w:t>
+      </w:r>
+    </w:p>
+    <w:p/>
+    <w:p>
+      <w:pPr>
+        <w:jc w:val="center"/>
+      </w:pPr>
+      <w:r>
+        <w:drawing>
+          <wp:inline xmlns:a="http://schemas.openxmlformats.org/drawingml/2006/main" xmlns:pic="http://schemas.openxmlformats.org/drawingml/2006/picture">
+            <wp:extent cx="5669280" cy="5719083"/>
+            <wp:docPr id="31" name="Picture 31"/>
+            <wp:cNvGraphicFramePr>
+              <a:graphicFrameLocks noChangeAspect="1"/>
+            </wp:cNvGraphicFramePr>
+            <a:graphic>
+              <a:graphicData uri="http://schemas.openxmlformats.org/drawingml/2006/picture">
+                <pic:pic>
+                  <pic:nvPicPr>
+                    <pic:cNvPr id="0" name="31_render_swagger.png"/>
+                    <pic:cNvPicPr/>
+                  </pic:nvPicPr>
+                  <pic:blipFill>
+                    <a:blip r:embed="rId39"/>
+                    <a:stretch>
+                      <a:fillRect/>
+                    </a:stretch>
+                  </pic:blipFill>
+                  <pic:spPr>
+                    <a:xfrm>
+                      <a:off x="0" y="0"/>
+                      <a:ext cx="5669280" cy="5719083"/>
+                    </a:xfrm>
+                    <a:prstGeom prst="rect"/>
+                  </pic:spPr>
+                </pic:pic>
+              </a:graphicData>
+            </a:graphic>
+          </wp:inline>
+        </w:drawing>
+      </w:r>
+    </w:p>
+    <w:p>
+      <w:pPr>
+        <w:jc w:val="center"/>
+      </w:pPr>
+      <w:r>
+        <w:rPr>
+          <w:i/>
+          <w:sz w:val="18"/>
+        </w:rPr>
+        <w:t>Captura 31. Render Swagger</w:t>
+      </w:r>
+    </w:p>
+    <w:p/>
+    <w:p>
+      <w:r>
+        <w:t>La captura muestra Swagger UI en Render, evidencia de documentación interactiva de endpoints en el backend desplegado.</w:t>
+      </w:r>
+    </w:p>
+    <w:p/>
+    <w:p>
+      <w:pPr>
+        <w:pStyle w:val="Heading2"/>
+      </w:pPr>
+      <w:r>
+        <w:t>Captura 32: Vercel Flutter móvil</w:t>
+      </w:r>
+    </w:p>
+    <w:p/>
+    <w:p>
+      <w:pPr>
+        <w:jc w:val="center"/>
+      </w:pPr>
+      <w:r>
+        <w:drawing>
+          <wp:inline xmlns:a="http://schemas.openxmlformats.org/drawingml/2006/main" xmlns:pic="http://schemas.openxmlformats.org/drawingml/2006/picture">
+            <wp:extent cx="5669280" cy="12268903"/>
+            <wp:docPr id="32" name="Picture 32"/>
+            <wp:cNvGraphicFramePr>
+              <a:graphicFrameLocks noChangeAspect="1"/>
+            </wp:cNvGraphicFramePr>
+            <a:graphic>
+              <a:graphicData uri="http://schemas.openxmlformats.org/drawingml/2006/picture">
+                <pic:pic>
+                  <pic:nvPicPr>
+                    <pic:cNvPr id="0" name="10_flutter_home.png"/>
+                    <pic:cNvPicPr/>
+                  </pic:nvPicPr>
+                  <pic:blipFill>
+                    <a:blip r:embed="rId18"/>
+                    <a:stretch>
+                      <a:fillRect/>
+                    </a:stretch>
+                  </pic:blipFill>
+                  <pic:spPr>
+                    <a:xfrm>
+                      <a:off x="0" y="0"/>
+                      <a:ext cx="5669280" cy="12268903"/>
+                    </a:xfrm>
+                    <a:prstGeom prst="rect"/>
+                  </pic:spPr>
+                </pic:pic>
+              </a:graphicData>
+            </a:graphic>
+          </wp:inline>
+        </w:drawing>
+      </w:r>
+    </w:p>
+    <w:p>
+      <w:pPr>
+        <w:jc w:val="center"/>
+      </w:pPr>
+      <w:r>
+        <w:rPr>
+          <w:i/>
+          <w:sz w:val="18"/>
+        </w:rPr>
+        <w:t>Captura 32. Vercel Flutter móvil</w:t>
+      </w:r>
+    </w:p>
+    <w:p/>
+    <w:p>
+      <w:r>
+        <w:t>La evidencia muestra la app Flutter servida desde Vercel en viewport móvil, útil para validar que la interfaz sea usable en pantalla pequeña.</w:t>
+      </w:r>
+    </w:p>
+    <w:p/>
+    <w:p>
+      <w:pPr>
+        <w:pStyle w:val="Heading2"/>
+      </w:pPr>
+      <w:r>
+        <w:t>Captura 33: Vercel Flutter desktop</w:t>
+      </w:r>
+    </w:p>
+    <w:p/>
+    <w:p>
+      <w:pPr>
+        <w:jc w:val="center"/>
+      </w:pPr>
+      <w:r>
+        <w:drawing>
+          <wp:inline xmlns:a="http://schemas.openxmlformats.org/drawingml/2006/main" xmlns:pic="http://schemas.openxmlformats.org/drawingml/2006/picture">
+            <wp:extent cx="5669280" cy="3735250"/>
+            <wp:docPr id="33" name="Picture 33"/>
+            <wp:cNvGraphicFramePr>
+              <a:graphicFrameLocks noChangeAspect="1"/>
+            </wp:cNvGraphicFramePr>
+            <a:graphic>
+              <a:graphicData uri="http://schemas.openxmlformats.org/drawingml/2006/picture">
+                <pic:pic>
+                  <pic:nvPicPr>
+                    <pic:cNvPr id="0" name="33_vercel_flutter_desktop.png"/>
+                    <pic:cNvPicPr/>
+                  </pic:nvPicPr>
+                  <pic:blipFill>
+                    <a:blip r:embed="rId40"/>
+                    <a:stretch>
+                      <a:fillRect/>
+                    </a:stretch>
+                  </pic:blipFill>
+                  <pic:spPr>
+                    <a:xfrm>
+                      <a:off x="0" y="0"/>
+                      <a:ext cx="5669280" cy="3735250"/>
+                    </a:xfrm>
+                    <a:prstGeom prst="rect"/>
+                  </pic:spPr>
+                </pic:pic>
+              </a:graphicData>
+            </a:graphic>
+          </wp:inline>
+        </w:drawing>
+      </w:r>
+    </w:p>
+    <w:p>
+      <w:pPr>
+        <w:jc w:val="center"/>
+      </w:pPr>
+      <w:r>
+        <w:rPr>
+          <w:i/>
+          <w:sz w:val="18"/>
+        </w:rPr>
+        <w:t>Captura 33. Vercel Flutter desktop</w:t>
+      </w:r>
+    </w:p>
+    <w:p/>
+    <w:p>
+      <w:r>
+        <w:t>La captura muestra la misma app publicada en Vercel en viewport desktop, confirmando despliegue web/PWA.</w:t>
+      </w:r>
+    </w:p>
+    <w:p/>
+    <w:p>
+      <w:pPr>
+        <w:pStyle w:val="Heading2"/>
+      </w:pPr>
+      <w:r>
+        <w:t>Captura 34: Headers Render y Vercel</w:t>
+      </w:r>
+    </w:p>
+    <w:p/>
+    <w:p>
+      <w:pPr>
+        <w:jc w:val="center"/>
+      </w:pPr>
+      <w:r>
+        <w:drawing>
+          <wp:inline xmlns:a="http://schemas.openxmlformats.org/drawingml/2006/main" xmlns:pic="http://schemas.openxmlformats.org/drawingml/2006/picture">
+            <wp:extent cx="5669280" cy="3735250"/>
+            <wp:docPr id="34" name="Picture 34"/>
+            <wp:cNvGraphicFramePr>
+              <a:graphicFrameLocks noChangeAspect="1"/>
+            </wp:cNvGraphicFramePr>
+            <a:graphic>
+              <a:graphicData uri="http://schemas.openxmlformats.org/drawingml/2006/picture">
+                <pic:pic>
+                  <pic:nvPicPr>
+                    <pic:cNvPr id="0" name="34_despliegue_headers.png"/>
+                    <pic:cNvPicPr/>
+                  </pic:nvPicPr>
+                  <pic:blipFill>
+                    <a:blip r:embed="rId41"/>
+                    <a:stretch>
+                      <a:fillRect/>
+                    </a:stretch>
+                  </pic:blipFill>
+                  <pic:spPr>
+                    <a:xfrm>
+                      <a:off x="0" y="0"/>
+                      <a:ext cx="5669280" cy="3735250"/>
+                    </a:xfrm>
+                    <a:prstGeom prst="rect"/>
+                  </pic:spPr>
+                </pic:pic>
+              </a:graphicData>
+            </a:graphic>
+          </wp:inline>
+        </w:drawing>
+      </w:r>
+    </w:p>
+    <w:p>
+      <w:pPr>
+        <w:jc w:val="center"/>
+      </w:pPr>
+      <w:r>
+        <w:rPr>
+          <w:i/>
+          <w:sz w:val="18"/>
+        </w:rPr>
+        <w:t>Captura 34. Headers de despliegue</w:t>
+      </w:r>
+    </w:p>
+    <w:p/>
+    <w:p>
+      <w:r>
+        <w:t>La evidencia registra headers HTTP: Render responde desde uvicorn y Vercel sirve el frontend con infraestructura propia.</w:t>
+      </w:r>
+    </w:p>
+    <w:p/>
+    <w:p>
+      <w:pPr>
+        <w:pStyle w:val="Heading2"/>
+      </w:pPr>
+      <w:r>
+        <w:t>Captura 35: Ramas y versiones</w:t>
+      </w:r>
+    </w:p>
+    <w:p/>
+    <w:p>
+      <w:pPr>
+        <w:jc w:val="center"/>
+      </w:pPr>
+      <w:r>
+        <w:drawing>
+          <wp:inline xmlns:a="http://schemas.openxmlformats.org/drawingml/2006/main" xmlns:pic="http://schemas.openxmlformats.org/drawingml/2006/picture">
+            <wp:extent cx="5669280" cy="15414133"/>
+            <wp:docPr id="35" name="Picture 35"/>
+            <wp:cNvGraphicFramePr>
+              <a:graphicFrameLocks noChangeAspect="1"/>
+            </wp:cNvGraphicFramePr>
+            <a:graphic>
+              <a:graphicData uri="http://schemas.openxmlformats.org/drawingml/2006/picture">
+                <pic:pic>
+                  <pic:nvPicPr>
+                    <pic:cNvPr id="0" name="35_ramas_y_versiones.png"/>
+                    <pic:cNvPicPr/>
+                  </pic:nvPicPr>
+                  <pic:blipFill>
+                    <a:blip r:embed="rId42"/>
+                    <a:stretch>
+                      <a:fillRect/>
+                    </a:stretch>
+                  </pic:blipFill>
+                  <pic:spPr>
+                    <a:xfrm>
+                      <a:off x="0" y="0"/>
+                      <a:ext cx="5669280" cy="15414133"/>
+                    </a:xfrm>
+                    <a:prstGeom prst="rect"/>
+                  </pic:spPr>
+                </pic:pic>
+              </a:graphicData>
+            </a:graphic>
+          </wp:inline>
+        </w:drawing>
+      </w:r>
+    </w:p>
+    <w:p>
+      <w:pPr>
+        <w:jc w:val="center"/>
+      </w:pPr>
+      <w:r>
+        <w:rPr>
+          <w:i/>
+          <w:sz w:val="18"/>
+        </w:rPr>
+        <w:t>Captura 35. Ramas y versiones</w:t>
+      </w:r>
+    </w:p>
+    <w:p/>
+    <w:p>
+      <w:r>
+        <w:t>La captura consolida ramas remotas, commits recientes y metadata de modelos v0.1.0 y v0.2.0.</w:t>
+      </w:r>
+    </w:p>
+    <w:p/>
+    <w:p>
+      <w:pPr>
+        <w:pStyle w:val="Heading2"/>
+      </w:pPr>
+      <w:r>
+        <w:t>Captura 36: Supabase estado y esquema</w:t>
+      </w:r>
+    </w:p>
+    <w:p/>
+    <w:p>
+      <w:pPr>
+        <w:jc w:val="center"/>
+      </w:pPr>
+      <w:r>
+        <w:drawing>
+          <wp:inline xmlns:a="http://schemas.openxmlformats.org/drawingml/2006/main" xmlns:pic="http://schemas.openxmlformats.org/drawingml/2006/picture">
+            <wp:extent cx="5669280" cy="33090168"/>
+            <wp:docPr id="36" name="Picture 36"/>
+            <wp:cNvGraphicFramePr>
+              <a:graphicFrameLocks noChangeAspect="1"/>
+            </wp:cNvGraphicFramePr>
+            <a:graphic>
+              <a:graphicData uri="http://schemas.openxmlformats.org/drawingml/2006/picture">
+                <pic:pic>
+                  <pic:nvPicPr>
+                    <pic:cNvPr id="0" name="36_supabase_estado.png"/>
+                    <pic:cNvPicPr/>
+                  </pic:nvPicPr>
+                  <pic:blipFill>
+                    <a:blip r:embed="rId43"/>
+                    <a:stretch>
+                      <a:fillRect/>
+                    </a:stretch>
+                  </pic:blipFill>
+                  <pic:spPr>
+                    <a:xfrm>
+                      <a:off x="0" y="0"/>
+                      <a:ext cx="5669280" cy="33090168"/>
+                    </a:xfrm>
+                    <a:prstGeom prst="rect"/>
+                  </pic:spPr>
+                </pic:pic>
+              </a:graphicData>
+            </a:graphic>
+          </wp:inline>
+        </w:drawing>
+      </w:r>
+    </w:p>
+    <w:p>
+      <w:pPr>
+        <w:jc w:val="center"/>
+      </w:pPr>
+      <w:r>
+        <w:rPr>
+          <w:i/>
+          <w:sz w:val="18"/>
+        </w:rPr>
+        <w:t>Captura 36. Supabase estado</w:t>
+      </w:r>
+    </w:p>
+    <w:p/>
+    <w:p>
+      <w:r>
+        <w:t>La evidencia muestra que el esquema Supabase está versionado mediante SQL, junto con la nota técnica de que el conector privado requería reautenticación para capturar el dashboard real.</w:t>
+      </w:r>
+    </w:p>
+    <w:p/>
+    <w:p>
+      <w:pPr>
+        <w:pStyle w:val="Heading2"/>
+      </w:pPr>
+      <w:r>
+        <w:t>Captura 37: Vercel estado y configuración</w:t>
+      </w:r>
+    </w:p>
+    <w:p/>
+    <w:p>
+      <w:pPr>
+        <w:jc w:val="center"/>
+      </w:pPr>
+      <w:r>
+        <w:drawing>
+          <wp:inline xmlns:a="http://schemas.openxmlformats.org/drawingml/2006/main" xmlns:pic="http://schemas.openxmlformats.org/drawingml/2006/picture">
+            <wp:extent cx="5669280" cy="3735250"/>
+            <wp:docPr id="37" name="Picture 37"/>
+            <wp:cNvGraphicFramePr>
+              <a:graphicFrameLocks noChangeAspect="1"/>
+            </wp:cNvGraphicFramePr>
+            <a:graphic>
+              <a:graphicData uri="http://schemas.openxmlformats.org/drawingml/2006/picture">
+                <pic:pic>
+                  <pic:nvPicPr>
+                    <pic:cNvPr id="0" name="37_vercel_estado.png"/>
+                    <pic:cNvPicPr/>
+                  </pic:nvPicPr>
+                  <pic:blipFill>
+                    <a:blip r:embed="rId44"/>
+                    <a:stretch>
+                      <a:fillRect/>
+                    </a:stretch>
+                  </pic:blipFill>
+                  <pic:spPr>
+                    <a:xfrm>
+                      <a:off x="0" y="0"/>
+                      <a:ext cx="5669280" cy="3735250"/>
+                    </a:xfrm>
+                    <a:prstGeom prst="rect"/>
+                  </pic:spPr>
+                </pic:pic>
+              </a:graphicData>
+            </a:graphic>
+          </wp:inline>
+        </w:drawing>
+      </w:r>
+    </w:p>
+    <w:p>
+      <w:pPr>
+        <w:jc w:val="center"/>
+      </w:pPr>
+      <w:r>
+        <w:rPr>
+          <w:i/>
+          <w:sz w:val="18"/>
+        </w:rPr>
+        <w:t>Captura 37. Vercel estado</w:t>
+      </w:r>
+    </w:p>
+    <w:p/>
+    <w:p>
+      <w:r>
+        <w:t>La captura registra la URL pública de Vercel, headers de despliegue y app_flutter/vercel.json.</w:t>
+      </w:r>
+    </w:p>
+    <w:p/>
     <w:p/>
     <w:p/>
     <w:p>
@@ -5495,6 +6875,22 @@
         <w:t>Comparación formal v0.1.0 vs v0.2.0 documentada.</w:t>
       </w:r>
     </w:p>
+    <w:p>
+      <w:pPr>
+        <w:pStyle w:val="ListBullet"/>
+      </w:pPr>
+      <w:r>
+        <w:t>Capturas remotas de GitHub, Render y Vercel generadas.</w:t>
+      </w:r>
+    </w:p>
+    <w:p>
+      <w:pPr>
+        <w:pStyle w:val="ListBullet"/>
+      </w:pPr>
+      <w:r>
+        <w:t>Configuración de despliegue separada para v0.2.0 mediante render.v2.yaml.</w:t>
+      </w:r>
+    </w:p>
     <w:p/>
     <w:p/>
     <w:p/>
@@ -5503,7 +6899,7 @@
         <w:pStyle w:val="Heading1"/>
       </w:pPr>
       <w:r>
-        <w:t>21. Limitaciones</w:t>
+        <w:t>21. Recomendaciones de mejora</w:t>
       </w:r>
     </w:p>
     <w:p/>
@@ -5512,6 +6908,74 @@
         <w:pStyle w:val="ListNumber"/>
       </w:pPr>
       <w:r>
+        <w:t>Reautenticar conectores GitHub, Vercel y Supabase para capturar dashboards privados directamente desde el navegador o MCP.</w:t>
+      </w:r>
+    </w:p>
+    <w:p>
+      <w:pPr>
+        <w:pStyle w:val="ListNumber"/>
+      </w:pPr>
+      <w:r>
+        <w:t>Crear un servicio Render separado frost-puno-api-v2 usando render.v2.yaml, rama codex/model-v0-2-0 y autoDeploy=false.</w:t>
+      </w:r>
+    </w:p>
+    <w:p>
+      <w:pPr>
+        <w:pStyle w:val="ListNumber"/>
+      </w:pPr>
+      <w:r>
+        <w:t>Agregar un selector interno o endpoint /ml/model-info-v2 solo para demo académica, sin cambiar la predicción productiva.</w:t>
+      </w:r>
+    </w:p>
+    <w:p>
+      <w:pPr>
+        <w:pStyle w:val="ListNumber"/>
+      </w:pPr>
+      <w:r>
+        <w:t>Validar v0.2.0 con datos independientes de SENAMHI o reportes de campo antes de promoverlo.</w:t>
+      </w:r>
+    </w:p>
+    <w:p>
+      <w:pPr>
+        <w:pStyle w:val="ListNumber"/>
+      </w:pPr>
+      <w:r>
+        <w:t>Configurar Supabase real con ENABLE_SUPABASE=true solo después de verificar RLS, service role en Render y que Flutter no tenga claves privadas.</w:t>
+      </w:r>
+    </w:p>
+    <w:p>
+      <w:pPr>
+        <w:pStyle w:val="ListNumber"/>
+      </w:pPr>
+      <w:r>
+        <w:t>Conectar Vercel a la rama main para producción y a codex/model-v0-2-0 como preview, documentando ambas URLs.</w:t>
+      </w:r>
+    </w:p>
+    <w:p>
+      <w:pPr>
+        <w:pStyle w:val="ListNumber"/>
+      </w:pPr>
+      <w:r>
+        <w:t>Agregar monitoreo básico: latencia de Render, errores de /predict/frost-risk, tasa de permisos GPS denegados y registros de predicción.</w:t>
+      </w:r>
+    </w:p>
+    <w:p/>
+    <w:p/>
+    <w:p/>
+    <w:p>
+      <w:pPr>
+        <w:pStyle w:val="Heading1"/>
+      </w:pPr>
+      <w:r>
+        <w:t>22. Limitaciones</w:t>
+      </w:r>
+    </w:p>
+    <w:p/>
+    <w:p>
+      <w:pPr>
+        <w:pStyle w:val="ListNumber"/>
+      </w:pPr>
+      <w:r>
         <w:t>INEI se usa mediante una semilla curada MVP, no mediante extracción oficial completa automática.</w:t>
       </w:r>
     </w:p>
@@ -5579,7 +7043,7 @@
         <w:pStyle w:val="Heading1"/>
       </w:pPr>
       <w:r>
-        <w:t>22. Trabajos futuros</w:t>
+        <w:t>23. Trabajos futuros</w:t>
       </w:r>
     </w:p>
     <w:p/>
@@ -5669,7 +7133,7 @@
         <w:pStyle w:val="Heading2"/>
       </w:pPr>
       <w:r>
-        <w:t>22.1 Evolución móvil y climática planificada</w:t>
+        <w:t>23.1 Evolución móvil y climática planificada</w:t>
       </w:r>
     </w:p>
     <w:p/>
@@ -5692,7 +7156,7 @@
         <w:pStyle w:val="Heading1"/>
       </w:pPr>
       <w:r>
-        <w:t>23. Conclusiones</w:t>
+        <w:t>24. Conclusiones</w:t>
       </w:r>
     </w:p>
     <w:p/>
@@ -5776,7 +7240,7 @@
         <w:pStyle w:val="Heading1"/>
       </w:pPr>
       <w:r>
-        <w:t>24. Bibliografía</w:t>
+        <w:t>25. Bibliografía</w:t>
       </w:r>
     </w:p>
     <w:p/>
@@ -5858,7 +7322,7 @@
         <w:pStyle w:val="Heading1"/>
       </w:pPr>
       <w:r>
-        <w:t>25. Anexos</w:t>
+        <w:t>26. Anexos</w:t>
       </w:r>
     </w:p>
     <w:p/>
@@ -5867,7 +7331,7 @@
         <w:pStyle w:val="Heading2"/>
       </w:pPr>
       <w:r>
-        <w:t>25.1 Comandos de ejecución</w:t>
+        <w:t>26.1 Comandos de ejecución</w:t>
       </w:r>
     </w:p>
     <w:p/>
@@ -6074,7 +7538,7 @@
         <w:pStyle w:val="Heading2"/>
       </w:pPr>
       <w:r>
-        <w:t>25.2 Estructura de carpetas</w:t>
+        <w:t>26.2 Estructura de carpetas</w:t>
       </w:r>
     </w:p>
     <w:p/>
@@ -6196,7 +7660,7 @@
         <w:pStyle w:val="Heading2"/>
       </w:pPr>
       <w:r>
-        <w:t>25.3 Ejemplo JSON de predicción</w:t>
+        <w:t>26.3 Ejemplo JSON de predicción</w:t>
       </w:r>
     </w:p>
     <w:p/>
@@ -6514,7 +7978,7 @@
         <w:pStyle w:val="Heading2"/>
       </w:pPr>
       <w:r>
-        <w:t>25.4 Comandos del modelo experimental v0.2.0</w:t>
+        <w:t>26.4 Comandos del modelo experimental v0.2.0</w:t>
       </w:r>
     </w:p>
     <w:p/>
@@ -6643,7 +8107,7 @@
         <w:pStyle w:val="Heading2"/>
       </w:pPr>
       <w:r>
-        <w:t>25.5 Checklist de despliegue futuro</w:t>
+        <w:t>26.5 Checklist de despliegue futuro</w:t>
       </w:r>
     </w:p>
     <w:p/>

</xml_diff>

<commit_message>
feat: agregar mejora supervisada y branding movil
</commit_message>
<xml_diff>
--- a/docs/informe_frost_puno_completo.docx
+++ b/docs/informe_frost_puno_completo.docx
@@ -3164,6 +3164,65 @@
       </w:r>
     </w:p>
     <w:p/>
+    <w:p>
+      <w:pPr>
+        <w:pStyle w:val="Heading2"/>
+      </w:pPr>
+      <w:r>
+        <w:t>15.4 Feedback y observaciones para mejora supervisada</w:t>
+      </w:r>
+    </w:p>
+    <w:p/>
+    <w:p>
+      <w:r>
+        <w:t>Se agregó una migración incremental:</w:t>
+      </w:r>
+    </w:p>
+    <w:p/>
+    <w:p>
+      <w:pPr>
+        <w:spacing w:after="20"/>
+        <w:ind w:left="259"/>
+      </w:pPr>
+      <w:r>
+        <w:rPr>
+          <w:rFonts w:ascii="Consolas" w:hAnsi="Consolas"/>
+          <w:color w:val="0B2545"/>
+          <w:sz w:val="17"/>
+        </w:rPr>
+        <w:t>supabase/migrations/002_add_feedback_and_observations.sql</w:t>
+      </w:r>
+    </w:p>
+    <w:p/>
+    <w:p>
+      <w:r>
+        <w:t>Esta migración prepara dos tablas:</w:t>
+      </w:r>
+    </w:p>
+    <w:p/>
+    <w:p>
+      <w:pPr>
+        <w:pStyle w:val="ListBullet"/>
+      </w:pPr>
+      <w:r>
+        <w:t>prediction_feedback: registra correcciones o confirmaciones de usuarios/productores sobre una predicción.</w:t>
+      </w:r>
+    </w:p>
+    <w:p>
+      <w:pPr>
+        <w:pStyle w:val="ListBullet"/>
+      </w:pPr>
+      <w:r>
+        <w:t>official_frost_observations: registra observaciones oficiales o verificadas en campo, por ejemplo SENAMHI o campañas de validación.</w:t>
+      </w:r>
+    </w:p>
+    <w:p/>
+    <w:p>
+      <w:r>
+        <w:t>Estas tablas no hacen que el modelo se entrene solo. Su objetivo es almacenar evidencia revisable para evaluar modelos candidatos, detectar falsos positivos/falsos negativos y decidir manualmente si una versión debe promoverse.</w:t>
+      </w:r>
+    </w:p>
+    <w:p/>
     <w:p/>
     <w:p/>
     <w:p>
@@ -3330,6 +3389,70 @@
     <w:p>
       <w:r>
         <w:t>La app fue creada para Android y Web. Usa --dart-define=API_BASE_URL para configurar el backend según entorno.</w:t>
+      </w:r>
+    </w:p>
+    <w:p/>
+    <w:p>
+      <w:pPr>
+        <w:pStyle w:val="Heading2"/>
+      </w:pPr>
+      <w:r>
+        <w:t>16.5 Icono y acabado móvil</w:t>
+      </w:r>
+    </w:p>
+    <w:p/>
+    <w:p>
+      <w:r>
+        <w:t>El APK y la PWA usan un icono propio de FrostPuno con identidad visual altoandina/fría. Los assets se actualizaron en:</w:t>
+      </w:r>
+    </w:p>
+    <w:p/>
+    <w:p>
+      <w:pPr>
+        <w:spacing w:after="20"/>
+        <w:ind w:left="259"/>
+      </w:pPr>
+      <w:r>
+        <w:rPr>
+          <w:rFonts w:ascii="Consolas" w:hAnsi="Consolas"/>
+          <w:color w:val="0B2545"/>
+          <w:sz w:val="17"/>
+        </w:rPr>
+        <w:t>app_flutter/android/app/src/main/res/mipmap-*/ic_launcher.png</w:t>
+      </w:r>
+    </w:p>
+    <w:p>
+      <w:pPr>
+        <w:spacing w:after="20"/>
+        <w:ind w:left="259"/>
+      </w:pPr>
+      <w:r>
+        <w:rPr>
+          <w:rFonts w:ascii="Consolas" w:hAnsi="Consolas"/>
+          <w:color w:val="0B2545"/>
+          <w:sz w:val="17"/>
+        </w:rPr>
+        <w:t>app_flutter/web/icons/</w:t>
+      </w:r>
+    </w:p>
+    <w:p>
+      <w:pPr>
+        <w:spacing w:after="20"/>
+        <w:ind w:left="259"/>
+      </w:pPr>
+      <w:r>
+        <w:rPr>
+          <w:rFonts w:ascii="Consolas" w:hAnsi="Consolas"/>
+          <w:color w:val="0B2545"/>
+          <w:sz w:val="17"/>
+        </w:rPr>
+        <w:t>app_flutter/web/favicon.png</w:t>
+      </w:r>
+    </w:p>
+    <w:p/>
+    <w:p>
+      <w:r>
+        <w:t>La pantalla inicial también muestra una tarjeta de “mejora supervisada”, explicando que el sistema registra evidencia, evalúa contra observaciones y versiona modelos antes de promover cambios.</w:t>
       </w:r>
     </w:p>
     <w:p/>
@@ -4098,6 +4221,12 @@
     <w:p/>
     <w:p>
       <w:r>
+        <w:t>La mejora supervisada usa las tablas prediction_feedback y official_frost_observations para almacenar observaciones verificables que luego pueden alimentar evaluaciones ML.</w:t>
+      </w:r>
+    </w:p>
+    <w:p/>
+    <w:p>
+      <w:r>
         <w:t>Durante la generación automática de evidencias, los conectores privados de GitHub, Vercel y Supabase devolvieron token_expired. Por ello, las capturas de dashboard privado deben repetirse tras reautenticar los conectores o desde la sesión web del navegador. Las evidencias incluidas muestran el estado público del despliegue y la configuración versionada.</w:t>
       </w:r>
     </w:p>
@@ -4228,7 +4357,7 @@
       <w:r>
         <w:drawing>
           <wp:inline xmlns:a="http://schemas.openxmlformats.org/drawingml/2006/main" xmlns:pic="http://schemas.openxmlformats.org/drawingml/2006/picture">
-            <wp:extent cx="5669280" cy="25814730"/>
+            <wp:extent cx="5669280" cy="26209007"/>
             <wp:docPr id="1" name="Picture 1"/>
             <wp:cNvGraphicFramePr>
               <a:graphicFrameLocks noChangeAspect="1"/>
@@ -4249,7 +4378,7 @@
                   <pic:spPr>
                     <a:xfrm>
                       <a:off x="0" y="0"/>
-                      <a:ext cx="5669280" cy="25814730"/>
+                      <a:ext cx="5669280" cy="26209007"/>
                     </a:xfrm>
                     <a:prstGeom prst="rect"/>
                   </pic:spPr>
@@ -5434,7 +5563,7 @@
       <w:r>
         <w:drawing>
           <wp:inline xmlns:a="http://schemas.openxmlformats.org/drawingml/2006/main" xmlns:pic="http://schemas.openxmlformats.org/drawingml/2006/picture">
-            <wp:extent cx="5669280" cy="33090168"/>
+            <wp:extent cx="5669280" cy="36842019"/>
             <wp:docPr id="19" name="Picture 19"/>
             <wp:cNvGraphicFramePr>
               <a:graphicFrameLocks noChangeAspect="1"/>
@@ -5455,7 +5584,7 @@
                   <pic:spPr>
                     <a:xfrm>
                       <a:off x="0" y="0"/>
-                      <a:ext cx="5669280" cy="33090168"/>
+                      <a:ext cx="5669280" cy="36842019"/>
                     </a:xfrm>
                     <a:prstGeom prst="rect"/>
                   </pic:spPr>
@@ -5769,7 +5898,7 @@
       <w:r>
         <w:drawing>
           <wp:inline xmlns:a="http://schemas.openxmlformats.org/drawingml/2006/main" xmlns:pic="http://schemas.openxmlformats.org/drawingml/2006/picture">
-            <wp:extent cx="5669280" cy="7673864"/>
+            <wp:extent cx="5669280" cy="8844243"/>
             <wp:docPr id="24" name="Picture 24"/>
             <wp:cNvGraphicFramePr>
               <a:graphicFrameLocks noChangeAspect="1"/>
@@ -5790,7 +5919,7 @@
                   <pic:spPr>
                     <a:xfrm>
                       <a:off x="0" y="0"/>
-                      <a:ext cx="5669280" cy="7673864"/>
+                      <a:ext cx="5669280" cy="8844243"/>
                     </a:xfrm>
                     <a:prstGeom prst="rect"/>
                   </pic:spPr>
@@ -6891,6 +7020,30 @@
         <w:t>Configuración de despliegue separada para v0.2.0 mediante render.v2.yaml.</w:t>
       </w:r>
     </w:p>
+    <w:p>
+      <w:pPr>
+        <w:pStyle w:val="ListBullet"/>
+      </w:pPr>
+      <w:r>
+        <w:t>Icono propio de APK/PWA agregado.</w:t>
+      </w:r>
+    </w:p>
+    <w:p>
+      <w:pPr>
+        <w:pStyle w:val="ListBullet"/>
+      </w:pPr>
+      <w:r>
+        <w:t>Flujo de mejora supervisada con observaciones tipo SENAMHI/campo agregado.</w:t>
+      </w:r>
+    </w:p>
+    <w:p>
+      <w:pPr>
+        <w:pStyle w:val="ListBullet"/>
+      </w:pPr>
+      <w:r>
+        <w:t>Supabase preparado para feedback y observaciones oficiales.</w:t>
+      </w:r>
+    </w:p>
     <w:p/>
     <w:p/>
     <w:p/>
@@ -6959,6 +7112,14 @@
         <w:t>Agregar monitoreo básico: latencia de Render, errores de /predict/frost-risk, tasa de permisos GPS denegados y registros de predicción.</w:t>
       </w:r>
     </w:p>
+    <w:p>
+      <w:pPr>
+        <w:pStyle w:val="ListNumber"/>
+      </w:pPr>
+      <w:r>
+        <w:t>Reemplazar el archivo de muestra SENAMHI por observaciones oficiales completas y recalcular senamhi_observation_evaluation_v0_2_0.json.</w:t>
+      </w:r>
+    </w:p>
     <w:p/>
     <w:p/>
     <w:p/>
@@ -6984,7 +7145,7 @@
         <w:pStyle w:val="ListNumber"/>
       </w:pPr>
       <w:r>
-        <w:t>SENAMHI aún no está integrado como validación oficial completa.</w:t>
+        <w:t>SENAMHI aún no está integrado como extracción oficial automática completa; sin embargo, ya existe un contrato de observaciones y un script de evaluación externa.</w:t>
       </w:r>
     </w:p>
     <w:p>
@@ -6992,7 +7153,7 @@
         <w:pStyle w:val="ListNumber"/>
       </w:pPr>
       <w:r>
-        <w:t>Las etiquetas iniciales se generan con reglas térmicas, no con observaciones de daño agrícola.</w:t>
+        <w:t>Las etiquetas iniciales se generan con reglas térmicas, no con observaciones de daño agrícola; la nueva ruta de feedback/observaciones permite reemplazar progresivamente esa limitación.</w:t>
       </w:r>
     </w:p>
     <w:p>
@@ -7033,6 +7194,54 @@
       </w:pPr>
       <w:r>
         <w:t>La versión v0.2.0 mejora la evaluación, pero aún usa una etiqueta rule-based; falta validación con eventos reales.</w:t>
+      </w:r>
+    </w:p>
+    <w:p/>
+    <w:p>
+      <w:pPr>
+        <w:pStyle w:val="Heading2"/>
+      </w:pPr>
+      <w:r>
+        <w:t>22.1 Limitaciones mitigadas en esta iteración</w:t>
+      </w:r>
+    </w:p>
+    <w:p/>
+    <w:p>
+      <w:pPr>
+        <w:pStyle w:val="ListBullet"/>
+      </w:pPr>
+      <w:r>
+        <w:t>Métrica perfecta v0.1.0: mitigada con v0.2.0, eliminación de leakage y split por distrito.</w:t>
+      </w:r>
+    </w:p>
+    <w:p>
+      <w:pPr>
+        <w:pStyle w:val="ListBullet"/>
+      </w:pPr>
+      <w:r>
+        <w:t>SENAMHI: mitigada parcialmente con data/validation/senamhi_frost_observations_sample.csv y evaluate_observed_events.py.</w:t>
+      </w:r>
+    </w:p>
+    <w:p>
+      <w:pPr>
+        <w:pStyle w:val="ListBullet"/>
+      </w:pPr>
+      <w:r>
+        <w:t>Daño agrícola observado: mitigado parcialmente con tablas Supabase para feedback y observaciones.</w:t>
+      </w:r>
+    </w:p>
+    <w:p>
+      <w:pPr>
+        <w:pStyle w:val="ListBullet"/>
+      </w:pPr>
+      <w:r>
+        <w:t>App móvil: mejorada con icono APK/PWA propio y tarjeta de mejora supervisada.</w:t>
+      </w:r>
+    </w:p>
+    <w:p/>
+    <w:p>
+      <w:r>
+        <w:t>La mitigación no significa que el problema esté cerrado para producción. Significa que el proyecto ya tiene una ruta técnica clara para resolverlo con datos oficiales.</w:t>
       </w:r>
     </w:p>
     <w:p/>
@@ -8107,7 +8316,149 @@
         <w:pStyle w:val="Heading2"/>
       </w:pPr>
       <w:r>
-        <w:t>26.5 Checklist de despliegue futuro</w:t>
+        <w:t>26.5 Comandos de mejora supervisada</w:t>
+      </w:r>
+    </w:p>
+    <w:p/>
+    <w:p>
+      <w:pPr>
+        <w:spacing w:after="20"/>
+        <w:ind w:left="259"/>
+      </w:pPr>
+      <w:r>
+        <w:rPr>
+          <w:rFonts w:ascii="Consolas" w:hAnsi="Consolas"/>
+          <w:color w:val="0B2545"/>
+          <w:sz w:val="17"/>
+        </w:rPr>
+        <w:t>python -m ml_pipeline.evaluation.evaluate_observed_events</w:t>
+      </w:r>
+    </w:p>
+    <w:p/>
+    <w:p>
+      <w:r>
+        <w:t>Archivos relacionados:</w:t>
+      </w:r>
+    </w:p>
+    <w:p/>
+    <w:p>
+      <w:pPr>
+        <w:spacing w:after="20"/>
+        <w:ind w:left="259"/>
+      </w:pPr>
+      <w:r>
+        <w:rPr>
+          <w:rFonts w:ascii="Consolas" w:hAnsi="Consolas"/>
+          <w:color w:val="0B2545"/>
+          <w:sz w:val="17"/>
+        </w:rPr>
+        <w:t>data/validation/senamhi_frost_observations_sample.csv</w:t>
+      </w:r>
+    </w:p>
+    <w:p>
+      <w:pPr>
+        <w:spacing w:after="20"/>
+        <w:ind w:left="259"/>
+      </w:pPr>
+      <w:r>
+        <w:rPr>
+          <w:rFonts w:ascii="Consolas" w:hAnsi="Consolas"/>
+          <w:color w:val="0B2545"/>
+          <w:sz w:val="17"/>
+        </w:rPr>
+        <w:t>ml_pipeline/evaluation/senamhi_observation_evaluation_v0_2_0.json</w:t>
+      </w:r>
+    </w:p>
+    <w:p>
+      <w:pPr>
+        <w:spacing w:after="20"/>
+        <w:ind w:left="259"/>
+      </w:pPr>
+      <w:r>
+        <w:rPr>
+          <w:rFonts w:ascii="Consolas" w:hAnsi="Consolas"/>
+          <w:color w:val="0B2545"/>
+          <w:sz w:val="17"/>
+        </w:rPr>
+        <w:t>supabase/migrations/002_add_feedback_and_observations.sql</w:t>
+      </w:r>
+    </w:p>
+    <w:p/>
+    <w:p>
+      <w:r>
+        <w:t>Metricas de muestra:</w:t>
+      </w:r>
+    </w:p>
+    <w:p/>
+    <w:p>
+      <w:pPr>
+        <w:spacing w:after="20"/>
+        <w:ind w:left="259"/>
+      </w:pPr>
+      <w:r>
+        <w:rPr>
+          <w:rFonts w:ascii="Consolas" w:hAnsi="Consolas"/>
+          <w:color w:val="0B2545"/>
+          <w:sz w:val="17"/>
+        </w:rPr>
+        <w:t>accuracy = 0.6000</w:t>
+      </w:r>
+    </w:p>
+    <w:p>
+      <w:pPr>
+        <w:spacing w:after="20"/>
+        <w:ind w:left="259"/>
+      </w:pPr>
+      <w:r>
+        <w:rPr>
+          <w:rFonts w:ascii="Consolas" w:hAnsi="Consolas"/>
+          <w:color w:val="0B2545"/>
+          <w:sz w:val="17"/>
+        </w:rPr>
+        <w:t>precision_macro = 0.3889</w:t>
+      </w:r>
+    </w:p>
+    <w:p>
+      <w:pPr>
+        <w:spacing w:after="20"/>
+        <w:ind w:left="259"/>
+      </w:pPr>
+      <w:r>
+        <w:rPr>
+          <w:rFonts w:ascii="Consolas" w:hAnsi="Consolas"/>
+          <w:color w:val="0B2545"/>
+          <w:sz w:val="17"/>
+        </w:rPr>
+        <w:t>recall_macro = 0.5000</w:t>
+      </w:r>
+    </w:p>
+    <w:p>
+      <w:pPr>
+        <w:spacing w:after="20"/>
+        <w:ind w:left="259"/>
+      </w:pPr>
+      <w:r>
+        <w:rPr>
+          <w:rFonts w:ascii="Consolas" w:hAnsi="Consolas"/>
+          <w:color w:val="0B2545"/>
+          <w:sz w:val="17"/>
+        </w:rPr>
+        <w:t>f1_macro = 0.4333</w:t>
+      </w:r>
+    </w:p>
+    <w:p/>
+    <w:p>
+      <w:r>
+        <w:t>Estas metricas son demostrativas porque el archivo de observaciones es pequeño. El objetivo es probar el mecanismo de mejora supervisada.</w:t>
+      </w:r>
+    </w:p>
+    <w:p/>
+    <w:p>
+      <w:pPr>
+        <w:pStyle w:val="Heading2"/>
+      </w:pPr>
+      <w:r>
+        <w:t>26.6 Checklist de despliegue futuro</w:t>
       </w:r>
     </w:p>
     <w:p/>

</xml_diff>

<commit_message>
docs: preparar guion y material final de exposicion
</commit_message>
<xml_diff>
--- a/docs/informe_frost_puno_completo.docx
+++ b/docs/informe_frost_puno_completo.docx
@@ -8548,6 +8548,252 @@
       </w:pPr>
       <w:r>
         <w:t>[ ] Verificar que no existan claves Supabase en frontend.</w:t>
+      </w:r>
+    </w:p>
+    <w:p/>
+    <w:p/>
+    <w:p/>
+    <w:p>
+      <w:pPr>
+        <w:pStyle w:val="Heading1"/>
+      </w:pPr>
+      <w:r>
+        <w:t>27. Material final para exposicion y actualizacion de diapositivas</w:t>
+      </w:r>
+    </w:p>
+    <w:p/>
+    <w:p>
+      <w:r>
+        <w:t>Ademas del informe principal, se prepararon dos materiales de apoyo para la exposicion:</w:t>
+      </w:r>
+    </w:p>
+    <w:p/>
+    <w:p>
+      <w:pPr>
+        <w:spacing w:after="20"/>
+        <w:ind w:left="259"/>
+      </w:pPr>
+      <w:r>
+        <w:rPr>
+          <w:rFonts w:ascii="Consolas" w:hAnsi="Consolas"/>
+          <w:color w:val="0B2545"/>
+          <w:sz w:val="17"/>
+        </w:rPr>
+        <w:t>docs/guion_exposicion_frost_puno.docx</w:t>
+      </w:r>
+    </w:p>
+    <w:p>
+      <w:pPr>
+        <w:spacing w:after="20"/>
+        <w:ind w:left="259"/>
+      </w:pPr>
+      <w:r>
+        <w:rPr>
+          <w:rFonts w:ascii="Consolas" w:hAnsi="Consolas"/>
+          <w:color w:val="0B2545"/>
+          <w:sz w:val="17"/>
+        </w:rPr>
+        <w:t>docs/guia_codigo_frost_puno.txt</w:t>
+      </w:r>
+    </w:p>
+    <w:p>
+      <w:pPr>
+        <w:spacing w:after="20"/>
+        <w:ind w:left="259"/>
+      </w:pPr>
+      <w:r>
+        <w:rPr>
+          <w:rFonts w:ascii="Consolas" w:hAnsi="Consolas"/>
+          <w:color w:val="0B2545"/>
+          <w:sz w:val="17"/>
+        </w:rPr>
+        <w:t>docs/actualizacion_canva_frost_puno.md</w:t>
+      </w:r>
+    </w:p>
+    <w:p/>
+    <w:p>
+      <w:pPr>
+        <w:pStyle w:val="Heading2"/>
+      </w:pPr>
+      <w:r>
+        <w:t>27.1 Guion para tres expositores</w:t>
+      </w:r>
+    </w:p>
+    <w:p/>
+    <w:p>
+      <w:r>
+        <w:t>El archivo docs/guion_exposicion_frost_puno.docx divide la exposicion en tres partes:</w:t>
+      </w:r>
+    </w:p>
+    <w:p/>
+    <w:p>
+      <w:pPr>
+        <w:pStyle w:val="ListBullet"/>
+      </w:pPr>
+      <w:r>
+        <w:t>Expositor 1: problema regional, usuario objetivo y experiencia movil.</w:t>
+      </w:r>
+    </w:p>
+    <w:p>
+      <w:pPr>
+        <w:pStyle w:val="ListBullet"/>
+      </w:pPr>
+      <w:r>
+        <w:t>Expositor 2: arquitectura distribuida, FastAPI, Supabase, Render, Vercel y GitHub Actions.</w:t>
+      </w:r>
+    </w:p>
+    <w:p>
+      <w:pPr>
+        <w:pStyle w:val="ListBullet"/>
+      </w:pPr>
+      <w:r>
+        <w:t>Expositor 3: codigo, pipeline ML, data leakage, modelo v0.2.0 y mejora supervisada.</w:t>
+      </w:r>
+    </w:p>
+    <w:p/>
+    <w:p>
+      <w:r>
+        <w:t>El guion incluye tiempos sugeridos, frases de transicion, preguntas probables del jurado y respuestas cortas.</w:t>
+      </w:r>
+    </w:p>
+    <w:p/>
+    <w:p>
+      <w:pPr>
+        <w:pStyle w:val="Heading2"/>
+      </w:pPr>
+      <w:r>
+        <w:t>27.2 Guia tecnica para explicar codigo</w:t>
+      </w:r>
+    </w:p>
+    <w:p/>
+    <w:p>
+      <w:r>
+        <w:t>El archivo docs/guia_codigo_frost_puno.txt explica la distribucion del codigo por carpetas y archivos principales. Esta pensado para que el expositor pueda responder donde vive cada parte:</w:t>
+      </w:r>
+    </w:p>
+    <w:p/>
+    <w:p>
+      <w:pPr>
+        <w:pStyle w:val="ListBullet"/>
+      </w:pPr>
+      <w:r>
+        <w:t>App Flutter: app_flutter/lib.</w:t>
+      </w:r>
+    </w:p>
+    <w:p>
+      <w:pPr>
+        <w:pStyle w:val="ListBullet"/>
+      </w:pPr>
+      <w:r>
+        <w:t>Backend FastAPI: backend_fastapi/app.</w:t>
+      </w:r>
+    </w:p>
+    <w:p>
+      <w:pPr>
+        <w:pStyle w:val="ListBullet"/>
+      </w:pPr>
+      <w:r>
+        <w:t>Pipeline ML: ml_pipeline.</w:t>
+      </w:r>
+    </w:p>
+    <w:p>
+      <w:pPr>
+        <w:pStyle w:val="ListBullet"/>
+      </w:pPr>
+      <w:r>
+        <w:t>Datasets: data.</w:t>
+      </w:r>
+    </w:p>
+    <w:p>
+      <w:pPr>
+        <w:pStyle w:val="ListBullet"/>
+      </w:pPr>
+      <w:r>
+        <w:t>Supabase: supabase.</w:t>
+      </w:r>
+    </w:p>
+    <w:p>
+      <w:pPr>
+        <w:pStyle w:val="ListBullet"/>
+      </w:pPr>
+      <w:r>
+        <w:t>CI/CD: .github/workflows.</w:t>
+      </w:r>
+    </w:p>
+    <w:p/>
+    <w:p>
+      <w:r>
+        <w:t>Tambien aclara que el sistema no aprende automaticamente en produccion. La mejora continua se maneja como un ciclo supervisado: feedback, observaciones, entrenamiento, evaluacion, comparacion y promocion manual.</w:t>
+      </w:r>
+    </w:p>
+    <w:p/>
+    <w:p>
+      <w:pPr>
+        <w:pStyle w:val="Heading2"/>
+      </w:pPr>
+      <w:r>
+        <w:t>27.3 Actualizacion de Canva</w:t>
+      </w:r>
+    </w:p>
+    <w:p/>
+    <w:p>
+      <w:r>
+        <w:t>El archivo docs/actualizacion_canva_frost_puno.md contiene una propuesta slide-by-slide para actualizar la presentacion de Canva con los cambios recientes:</w:t>
+      </w:r>
+    </w:p>
+    <w:p/>
+    <w:p>
+      <w:pPr>
+        <w:pStyle w:val="ListBullet"/>
+      </w:pPr>
+      <w:r>
+        <w:t>Nueva experiencia movil con GPS y clima automatico.</w:t>
+      </w:r>
+    </w:p>
+    <w:p>
+      <w:pPr>
+        <w:pStyle w:val="ListBullet"/>
+      </w:pPr>
+      <w:r>
+        <w:t>App lista para Android con icono propio.</w:t>
+      </w:r>
+    </w:p>
+    <w:p>
+      <w:pPr>
+        <w:pStyle w:val="ListBullet"/>
+      </w:pPr>
+      <w:r>
+        <w:t>Despliegue Render + Vercel + GitHub + Supabase.</w:t>
+      </w:r>
+    </w:p>
+    <w:p>
+      <w:pPr>
+        <w:pStyle w:val="ListBullet"/>
+      </w:pPr>
+      <w:r>
+        <w:t>Comparacion v0.1.0 vs v0.2.0.</w:t>
+      </w:r>
+    </w:p>
+    <w:p>
+      <w:pPr>
+        <w:pStyle w:val="ListBullet"/>
+      </w:pPr>
+      <w:r>
+        <w:t>Explicacion de data leakage.</w:t>
+      </w:r>
+    </w:p>
+    <w:p>
+      <w:pPr>
+        <w:pStyle w:val="ListBullet"/>
+      </w:pPr>
+      <w:r>
+        <w:t>Limitaciones honestas y mejoras pendientes.</w:t>
+      </w:r>
+    </w:p>
+    <w:p/>
+    <w:p>
+      <w:r>
+        <w:t>Durante esta actualizacion, los conectores de Canva, Vercel y Supabase respondieron con token_expired. Por ese motivo no se guardaron cambios remotos directamente desde el plugin en esta sesion; el material queda versionado en el repositorio para aplicarlo apenas se reconecten los servicios.</w:t>
       </w:r>
     </w:p>
     <w:sectPr>

</xml_diff>